<commit_message>
Add tmp paper outputs; revise manuscript text
Add generated temporary paper artifacts (DOCX, PDF, and multiple PNGs) under tmp/ (paper_check, paper_pages_check3, paper_pdf_ascii3, paper_ws) including files with localized names. Update workspace manuscript files (MD/PY) to refine Chinese and English abstracts, clarify contributions and system architecture, adjust figure paths, and add placeholders and notes for missing high-resolution diagrams (待补图A/B) as well as expanded ODI and planning sections. These changes include content edits for clarity and several generated/exported assets to support sample validation and figure export.
</commit_message>
<xml_diff>
--- a/论文/重构工作区/06_投稿包/采区智能规划设计一体化方法与系统_终稿收口版.docx
+++ b/论文/重构工作区/06_投稿包/采区智能规划设计一体化方法与系统_终稿收口版.docx
@@ -170,7 +170,7 @@
           <w:rFonts w:ascii="宋体" w:hAnsi="宋体" w:eastAsia="宋体"/>
           <w:sz w:val="21"/>
         </w:rPr>
-        <w:t>针对采区规划设计中地质数据离散、风险约束异构、方案比选割裂以及规划结果难以传递至接续与经济评价环节的问题，提出一种面向采区规划设计的一体化方法及其平台化实现框架。该方法以多源数据标准化和项目快照机制统一组织边界、钻孔、分层与设计参数，通过连续参数场构建实现离散钻孔信息向规划域地质表达的转换；以覆岩扰动指数（overburden disturbance index，ODI）统一表征地表沉陷、含水层扰动和上行开采等多场景风险，并结合候选方案池、多模式规划比选、三阶段接续组织和净现值分析构建连续决策链。在样例数据条件下，系统以 15 个钻孔样点为输入，生成采区边界与钻孔分布图、煤层厚度插值热力图、组合式规划结果图和扩展建模结果图，并输出 3 个工作面、11 条巷道及相关结构化结果文件。结果表明，所提方法已具备从数据导入、参数场构建、风险组织、方案规划到成果导出的端到端组织能力，中间规划对象能够持续传递至接续与经济评价环节。当前验证主要支撑方法链与对象链贯通的可行性论证，尚不足以推导真实矿井条件下的优选结论；相关判断仍需结合敏东矿实矿案例、参数标定和基线对照进一步检验。</w:t>
+        <w:t>针对采区规划设计中地质数据离散、风险约束异构、方案比选与后续评价脱节等问题，提出一种面向采区规划设计的一体化方法及其平台化实现框架。该方法通过多源数据标准化与项目快照机制统一组织边界、钻孔、分层和设计参数，利用连续参数场将离散钻孔信息转换为规划域地质表达，并以覆岩扰动指数（overburden disturbance index，ODI）统一表征地表沉陷、含水层扰动和上行开采等多场景风险；在此基础上，联接候选方案池、多模式规划比选、三阶段接续组织与净现值分析，形成连续决策链。样例验证表明：系统以 15 个钻孔样点为输入，可输出采区边界与钻孔分布图、煤层厚度插值图、多场景 ODI 风险图、规划结果图及扩展建模结果，并生成 3 个工作面、11 条巷道和相关结构化文件。结果说明，所提方法已经具备从数据组织、参数场构建和风险约束到方案生成、结果传递与导出的贯通能力。当前证据主要支撑方法链与对象链可行性，不足以推导真实矿井条件下的优选结论，相关判断仍需通过敏东矿实矿案例、参数标定和基线对照进一步检验。</w:t>
       </w:r>
     </w:p>
     <w:p>
@@ -250,7 +250,7 @@
           <w:rFonts w:ascii="Times New Roman" w:hAnsi="Times New Roman"/>
           <w:sz w:val="21"/>
         </w:rPr>
-        <w:t>To address the problems of discrete geological data, heterogeneous risk constraints, fragmented scheme comparison, and the difficulty of passing planning results forward to succession organization and economic evaluation in mining-district planning and design, an integrated method and its platform-based implementation framework are proposed. The method organizes boundary, borehole, stratigraphic, and design-parameter data through multi-source standardization and project snapshots, converts discrete borehole observations into continuous geological representations by constructing parameter fields, and unifies multi-scenario risks, including surface subsidence, aquifer disturbance, and upward mining, using the overburden disturbance index (ODI). On this basis, a continuous decision chain is established by coupling candidate-scheme pools, multi-mode planning comparison, three-stage succession organization, and net present value analysis. Under sample-data conditions, the system takes 15 borehole points as input, generates boundary-and-borehole distribution maps, coal-seam thickness interpolation maps, combined planning-result figures, and extended-modeling figures, and outputs 3 working faces, 11 roadways, and corresponding structured result files. The results show that the proposed method has formed an end-to-end organizational capability from data import, parameter-field construction, and risk organization to scheme planning and result export, and that intermediate planning objects can be continuously transmitted to succession and economic evaluation. The current validation mainly supports the connectivity of the method chain and object chain rather than optimization conclusions under real mine conditions; further verification still requires the Mindong mine case, parameter calibration, and baseline comparisons.</w:t>
+        <w:t>To address the disconnection among discrete geological data, heterogeneous risk constraints, scheme comparison, and downstream evaluation in mining-district planning and design, an integrated method and its platform-based implementation framework are proposed. The method unifies boundary, borehole, stratigraphic, and design-parameter data through multi-source standardization and project snapshots, transforms discrete borehole observations into continuous geological representations via parameter-field construction, and organizes multi-scenario risks, including surface subsidence, aquifer disturbance, and upward mining, within a unified overburden disturbance index (ODI) framework. By coupling candidate-scheme pools, multi-mode planning comparison, three-stage succession organization, and net present value analysis, a continuous decision chain is established. Sample-data validation shows that, with 15 borehole points as input, the system can produce boundary-and-borehole maps, coal-seam thickness interpolation maps, multi-scenario ODI risk maps, planning-result figures, extended-modeling outputs, 3 working faces, 11 roadways, and corresponding structured files. These results indicate that the proposed method has achieved end-to-end connectivity from data organization, parameter-field construction, and risk integration to scheme generation, result transmission, and export. The current evidence supports the feasibility of the method chain and object chain, rather than optimization conclusions under real mine conditions, and further validation is still required through the Mindong mine case, parameter calibration, and baseline comparisons.</w:t>
       </w:r>
     </w:p>
     <w:p>
@@ -590,7 +590,7 @@
           <w:rFonts w:ascii="宋体" w:hAnsi="宋体" w:eastAsia="宋体"/>
           <w:sz w:val="21"/>
         </w:rPr>
-        <w:t>基于此，本文针对采区规划设计流程割裂、结果难以贯通的现实问题，提出采区智能规划设计一体化方法，并依托既有平台系统开展样例验证。本文并不试图在当前证据条件下直接给出真实矿井条件下的最优方案，而是围绕“对象可组织、方法可贯通、结果可传递”这一主线展开论证：首先，构建覆盖参数场、风险场、候选规划、接续组织和经济评价的一体化方法链；其次，建立面向地表沉陷、含水层扰动和上行开采的多场景 ODI 风险组织框架；最后，在样例数据条件下完成从输入、建模、规划到导出的连续验证，并明确当前结论仅适用于方法可行性与链路有效性层面的论证，为后续敏东矿实矿案例研究和基线对照实验提供方法基础。</w:t>
+        <w:t>基于此，本文针对采区规划设计流程割裂、结果难以贯通的现实问题，提出采区智能规划设计一体化方法，并依托既有平台系统开展样例验证。本文的贡献主要体现在 3 个方面：其一，构建覆盖参数场、风险场、候选规划、接续组织和经济评价的一体化方法链，明确规划对象在“数据-模型-决策-评价”各阶段的传递关系；其二，建立面向地表沉陷、含水层扰动和上行开采的多场景 ODI 风险组织框架，使异构风险能够以统一口径进入方案生成与比选；其三，在样例数据条件下完成从输入、建模、规划到导出的连续验证，证明方法链与对象链具有可执行性。需要说明的是，本文当前结论仅适用于方法可行性与链路有效性层面的论证，不直接外推为真实矿井条件下的优选结论。</w:t>
       </w:r>
     </w:p>
     <w:p>
@@ -1234,8 +1234,8 @@
       <w:r>
         <w:drawing>
           <wp:inline xmlns:a="http://schemas.openxmlformats.org/drawingml/2006/main" xmlns:pic="http://schemas.openxmlformats.org/drawingml/2006/picture">
-            <wp:extent cx="5715000" cy="2801131"/>
-            <wp:docPr id="9" name="Picture 9"/>
+            <wp:extent cx="6263640" cy="3070039"/>
+            <wp:docPr id="1" name="Picture 1"/>
             <wp:cNvGraphicFramePr>
               <a:graphicFrameLocks noChangeAspect="1"/>
             </wp:cNvGraphicFramePr>
@@ -1247,7 +1247,7 @@
                     <pic:cNvPicPr/>
                   </pic:nvPicPr>
                   <pic:blipFill>
-                    <a:blip r:embed="rId17"/>
+                    <a:blip r:embed="rId9"/>
                     <a:stretch>
                       <a:fillRect/>
                     </a:stretch>
@@ -1255,7 +1255,7 @@
                   <pic:spPr>
                     <a:xfrm>
                       <a:off x="0" y="0"/>
-                      <a:ext cx="5715000" cy="2801131"/>
+                      <a:ext cx="6263640" cy="3070039"/>
                     </a:xfrm>
                     <a:prstGeom prst="rect"/>
                   </pic:spPr>
@@ -2351,13 +2351,25 @@
     </w:p>
     <w:p>
       <w:pPr>
+        <w:sectPr>
+          <w:type w:val="continuous"/>
+          <w:pgSz w:w="12240" w:h="15840"/>
+          <w:pgMar w:top="1247" w:right="1077" w:bottom="1247" w:left="1077" w:header="720" w:footer="720" w:gutter="0"/>
+          <w:cols w:space="425" w:num="2"/>
+          <w:docGrid w:linePitch="360"/>
+        </w:sectPr>
+      </w:pPr>
+    </w:p>
+    <w:p>
+      <w:pPr>
+        <w:spacing w:after="40"/>
         <w:jc w:val="center"/>
       </w:pPr>
       <w:r>
         <w:drawing>
           <wp:inline xmlns:a="http://schemas.openxmlformats.org/drawingml/2006/main" xmlns:pic="http://schemas.openxmlformats.org/drawingml/2006/picture">
-            <wp:extent cx="5532120" cy="3500357"/>
-            <wp:docPr id="10" name="Picture 10"/>
+            <wp:extent cx="5835315" cy="4434839"/>
+            <wp:docPr id="5" name="Picture 5"/>
             <wp:cNvGraphicFramePr>
               <a:graphicFrameLocks noChangeAspect="1"/>
             </wp:cNvGraphicFramePr>
@@ -2365,11 +2377,11 @@
               <a:graphicData uri="http://schemas.openxmlformats.org/drawingml/2006/picture">
                 <pic:pic>
                   <pic:nvPicPr>
-                    <pic:cNvPr id="0" name="技术路线图.png"/>
+                    <pic:cNvPr id="0" name="图5_多场景ODI风险分布组合图.png"/>
                     <pic:cNvPicPr/>
                   </pic:nvPicPr>
                   <pic:blipFill>
-                    <a:blip r:embed="rId18"/>
+                    <a:blip r:embed="rId13"/>
                     <a:stretch>
                       <a:fillRect/>
                     </a:stretch>
@@ -2377,7 +2389,7 @@
                   <pic:spPr>
                     <a:xfrm>
                       <a:off x="0" y="0"/>
-                      <a:ext cx="5532120" cy="3500357"/>
+                      <a:ext cx="5835315" cy="4434839"/>
                     </a:xfrm>
                     <a:prstGeom prst="rect"/>
                   </pic:spPr>
@@ -2390,22 +2402,41 @@
     </w:p>
     <w:p>
       <w:pPr>
+        <w:spacing w:after="40"/>
         <w:jc w:val="center"/>
       </w:pPr>
       <w:r>
-        <w:t>图5 ODI 风险组织与扰动分级技术路线图</w:t>
+        <w:rPr>
+          <w:rFonts w:ascii="宋体" w:hAnsi="宋体" w:eastAsia="宋体"/>
+          <w:b w:val="0"/>
+          <w:sz w:val="20"/>
+        </w:rPr>
+        <w:t>图5 多场景ODI风险分布结果图</w:t>
       </w:r>
     </w:p>
     <w:p>
-      <w:pPr/>
-      <w:r>
-        <w:t>图5给出了多场景 ODI 风险组织的技术路线。图中将地质因素与开采因素统一映射到输入层，再经位移响应、力学响应和水力响应构建覆岩扰动综合评价指标，并最终形成可用于规划阶段分级筛选的 ODI 表征结果。该图进一步说明，本文中的 ODI 并非单一经验指标，而是连接输入参数、响应特征和风险分级的统一组织框架。</w:t>
-      </w:r>
+      <w:pPr>
+        <w:sectPr>
+          <w:type w:val="continuous"/>
+          <w:pgSz w:w="12240" w:h="15840"/>
+          <w:pgMar w:top="1247" w:right="1077" w:bottom="1247" w:left="1077" w:header="720" w:footer="720" w:gutter="0"/>
+          <w:cols w:space="425" w:num="1"/>
+          <w:docGrid w:linePitch="360"/>
+        </w:sectPr>
+      </w:pPr>
     </w:p>
     <w:p>
       <w:pPr>
-        <w:jc w:val="left"/>
-      </w:pPr>
+        <w:spacing w:after="40"/>
+        <w:ind w:firstLine="420"/>
+      </w:pPr>
+      <w:r>
+        <w:rPr>
+          <w:rFonts w:ascii="宋体" w:hAnsi="宋体" w:eastAsia="宋体"/>
+          <w:sz w:val="21"/>
+        </w:rPr>
+        <w:t>图5给出了由 export_package 批量导出的多场景 ODI 风险分布结果。其中，子图 (a)、(b)、(c) 和 (d) 分别对应地表沉陷、含水层扰动评价、采掘接续以及全覆岩综合评价场景。与仅给出概念性技术路线相比，这组图更直接地表明本文提出的 ODI 组织框架已经能够在不同业务场景下形成可复核的空间风险结果，并保持统一的颜色标度、钻孔参照和结果表达口径。需要说明的是，批量导出包中同时还包含 ODI直方图、ODI等级饼图、参数散点矩阵 和结果摘要 JSON 等图件与结构化文件；本文主文仅保留最能支撑论证主线的热力图结果，用于说明 ODI 已从方法定义阶段进入可计算、可导出、可比较的样例验证阶段。</w:t>
+      </w:r>
     </w:p>
     <w:p>
       <w:pPr>
@@ -3216,7 +3247,7 @@
         <w:drawing>
           <wp:inline xmlns:a="http://schemas.openxmlformats.org/drawingml/2006/main" xmlns:pic="http://schemas.openxmlformats.org/drawingml/2006/picture">
             <wp:extent cx="6263640" cy="3776282"/>
-            <wp:docPr id="5" name="Picture 5"/>
+            <wp:docPr id="6" name="Picture 6"/>
             <wp:cNvGraphicFramePr>
               <a:graphicFrameLocks noChangeAspect="1"/>
             </wp:cNvGraphicFramePr>
@@ -3228,7 +3259,7 @@
                     <pic:cNvPicPr/>
                   </pic:nvPicPr>
                   <pic:blipFill>
-                    <a:blip r:embed="rId13"/>
+                    <a:blip r:embed="rId14"/>
                     <a:stretch>
                       <a:fillRect/>
                     </a:stretch>
@@ -3253,6 +3284,11 @@
         <w:jc w:val="center"/>
       </w:pPr>
       <w:r>
+        <w:rPr>
+          <w:rFonts w:ascii="宋体" w:hAnsi="宋体" w:eastAsia="宋体"/>
+          <w:b w:val="0"/>
+          <w:sz w:val="20"/>
+        </w:rPr>
         <w:t>图6 四模式智能规划协同关系图</w:t>
       </w:r>
     </w:p>
@@ -3273,7 +3309,60 @@
         <w:ind w:firstLine="420"/>
       </w:pPr>
       <w:r>
-        <w:t>图6展示了候选池生成、多目标评分和四模式筛选之间的协同关系。与传统“只输出一个结果方案”的方式相比，这种组织方式更符合采区规划中“多方案并行比较、人工与算法协同决策”的工程实际[11-15]，也为后续接续评价和经济比较保留了更充分的方案空间。</w:t>
+        <w:rPr>
+          <w:rFonts w:ascii="宋体" w:hAnsi="宋体" w:eastAsia="宋体"/>
+          <w:sz w:val="21"/>
+        </w:rPr>
+        <w:t>图6展示了候选池生成、多目标评分和四模式筛选之间的协同关系。与传统“只输出一个结果方案”的方式相比，这种组织方式更符合采区规划中“多方案并行比较、人工与算法协同决策”的工程实际</w:t>
+      </w:r>
+      <w:r>
+        <w:rPr>
+          <w:rFonts w:ascii="宋体" w:hAnsi="宋体" w:eastAsia="宋体"/>
+          <w:sz w:val="16"/>
+          <w:vertAlign w:val="superscript"/>
+        </w:rPr>
+        <w:t>[</w:t>
+      </w:r>
+      <w:hyperlink w:anchor="ref-11">
+        <w:r>
+          <w:rPr>
+            <w:color w:val="000000"/>
+            <w:vertAlign w:val="superscript"/>
+          </w:rPr>
+          <w:t>11</w:t>
+        </w:r>
+      </w:hyperlink>
+      <w:r>
+        <w:rPr>
+          <w:rFonts w:ascii="宋体" w:hAnsi="宋体" w:eastAsia="宋体"/>
+          <w:sz w:val="16"/>
+          <w:vertAlign w:val="superscript"/>
+        </w:rPr>
+        <w:t>-</w:t>
+      </w:r>
+      <w:hyperlink w:anchor="ref-15">
+        <w:r>
+          <w:rPr>
+            <w:color w:val="000000"/>
+            <w:vertAlign w:val="superscript"/>
+          </w:rPr>
+          <w:t>15</w:t>
+        </w:r>
+      </w:hyperlink>
+      <w:r>
+        <w:rPr>
+          <w:rFonts w:ascii="宋体" w:hAnsi="宋体" w:eastAsia="宋体"/>
+          <w:sz w:val="16"/>
+          <w:vertAlign w:val="superscript"/>
+        </w:rPr>
+        <w:t>]</w:t>
+      </w:r>
+      <w:r>
+        <w:rPr>
+          <w:rFonts w:ascii="宋体" w:hAnsi="宋体" w:eastAsia="宋体"/>
+          <w:sz w:val="21"/>
+        </w:rPr>
+        <w:t>，也为后续接续评价和经济比较保留了更充分的方案空间。</w:t>
       </w:r>
     </w:p>
     <w:p>
@@ -3837,7 +3926,7 @@
         <w:drawing>
           <wp:inline xmlns:a="http://schemas.openxmlformats.org/drawingml/2006/main" xmlns:pic="http://schemas.openxmlformats.org/drawingml/2006/picture">
             <wp:extent cx="6263640" cy="3776282"/>
-            <wp:docPr id="6" name="Picture 6"/>
+            <wp:docPr id="7" name="Picture 7"/>
             <wp:cNvGraphicFramePr>
               <a:graphicFrameLocks noChangeAspect="1"/>
             </wp:cNvGraphicFramePr>
@@ -3849,7 +3938,7 @@
                     <pic:cNvPicPr/>
                   </pic:nvPicPr>
                   <pic:blipFill>
-                    <a:blip r:embed="rId14"/>
+                    <a:blip r:embed="rId15"/>
                     <a:stretch>
                       <a:fillRect/>
                     </a:stretch>
@@ -3874,6 +3963,11 @@
         <w:jc w:val="center"/>
       </w:pPr>
       <w:r>
+        <w:rPr>
+          <w:rFonts w:ascii="宋体" w:hAnsi="宋体" w:eastAsia="宋体"/>
+          <w:b w:val="0"/>
+          <w:sz w:val="20"/>
+        </w:rPr>
         <w:t>图7 规划-接续-经济闭环评价图</w:t>
       </w:r>
     </w:p>
@@ -3894,6 +3988,10 @@
         <w:ind w:firstLine="420"/>
       </w:pPr>
       <w:r>
+        <w:rPr>
+          <w:rFonts w:ascii="宋体" w:hAnsi="宋体" w:eastAsia="宋体"/>
+          <w:sz w:val="21"/>
+        </w:rPr>
         <w:t>图7表明，本文方法并未把几何布局视为终点，而是把规划结果继续组织为接续分析和经济评价可直接调用的上游对象。由此，传统上后置的风险校核与经济比较被提前纳入同一条规划闭环之中，评价结果也能够反向作用于方案修订，而不再只是末端解释性结论。</w:t>
       </w:r>
     </w:p>
@@ -3920,7 +4018,7 @@
           <w:rFonts w:ascii="宋体" w:hAnsi="宋体" w:eastAsia="宋体"/>
           <w:sz w:val="21"/>
         </w:rPr>
-        <w:t>本文主文证据来自固定样例输入、版本化代码快照和脚本可再生图件，而非脱离运行结果的事后归纳。样例输入主要包括采区边界、钻孔数据和设计参数；中间与输出证据包括地质建模结果、采区设计结果、GNN 训练输出以及网格预测结果。文字整理与图件重构均基于代码快照 b0d24be 完成，其中主文机制图由脚本重新生成，主文结果图对应系统接口的实际输出。</w:t>
+        <w:t>本文主文证据来自固定样例输入、版本化代码快照和脚本可再生图件，而非脱离运行结果的事后归纳。样例输入主要包括采区边界、钻孔数据和设计参数；中间与输出证据包括地质建模结果、采区设计结果、data/export_package 中批量导出的多场景 ODI 图件与摘要文件，以及 GNN 训练输出和网格预测结果。文字整理与图件重构均基于代码快照 b0d24be 完成，其中主文机制图由脚本重新生成，主文结果图对应系统接口的实际输出。</w:t>
       </w:r>
     </w:p>
     <w:p>
@@ -4616,8 +4714,8 @@
       <w:r>
         <w:drawing>
           <wp:inline xmlns:a="http://schemas.openxmlformats.org/drawingml/2006/main" xmlns:pic="http://schemas.openxmlformats.org/drawingml/2006/picture">
-            <wp:extent cx="6263640" cy="2303775"/>
-            <wp:docPr id="7" name="Picture 7"/>
+            <wp:extent cx="6263640" cy="2305020"/>
+            <wp:docPr id="8" name="Picture 8"/>
             <wp:cNvGraphicFramePr>
               <a:graphicFrameLocks noChangeAspect="1"/>
             </wp:cNvGraphicFramePr>
@@ -4625,11 +4723,11 @@
               <a:graphicData uri="http://schemas.openxmlformats.org/drawingml/2006/picture">
                 <pic:pic>
                   <pic:nvPicPr>
-                    <pic:cNvPr id="0" name="候选图_采区综合空间信息与规划结果可视化界面.png"/>
+                    <pic:cNvPr id="0" name="图8_规划与采掘接续空间分布结果图.png"/>
                     <pic:cNvPicPr/>
                   </pic:nvPicPr>
                   <pic:blipFill>
-                    <a:blip r:embed="rId15"/>
+                    <a:blip r:embed="rId16"/>
                     <a:stretch>
                       <a:fillRect/>
                     </a:stretch>
@@ -4637,7 +4735,7 @@
                   <pic:spPr>
                     <a:xfrm>
                       <a:off x="0" y="0"/>
-                      <a:ext cx="6263640" cy="2303775"/>
+                      <a:ext cx="6263640" cy="2305020"/>
                     </a:xfrm>
                     <a:prstGeom prst="rect"/>
                   </pic:spPr>
@@ -4654,7 +4752,12 @@
         <w:jc w:val="center"/>
       </w:pPr>
       <w:r>
-        <w:t>图8 采区综合空间信息与规划结果可视化界面</w:t>
+        <w:rPr>
+          <w:rFonts w:ascii="宋体" w:hAnsi="宋体" w:eastAsia="宋体"/>
+          <w:b w:val="0"/>
+          <w:sz w:val="20"/>
+        </w:rPr>
+        <w:t>图8 规划结果到采掘接续的空间传递结果图</w:t>
       </w:r>
     </w:p>
     <w:p>
@@ -4674,7 +4777,11 @@
         <w:ind w:firstLine="420"/>
       </w:pPr>
       <w:r>
-        <w:t>图8给出了更贴近论文论证口径的组合式结果图。其中，子图 (a) 将采区边界、钻孔样点、16-3煤 厚度场与布局阶段 ODI 风险等值线置于同一空间底图中，说明原始采样信息、连续参数场与风险表达已经能够在统一坐标语义下叠合；子图 (b) 则以工作面组和关键巷道为主，展示候选规划结果如何以结构化几何对象形式输出。与单独的布局截图相比，这张组合图更能支撑本文的核心论点，即规划链条中的空间场、风险场和几何对象并非彼此分离的中间产物，而是能够在同一表达界面中保持一致口径，并继续传递到人工复核、接续分析与经济评价环节。需要同时说明的是，接口校核仍给出了“推进长度小于最小值 800.0 m”的提示，因此该结果更适合被解释为“候选设计对象可生成、可表达、可传递”的样例证据，而非真实矿井条件下的最终工程终判结果。</w:t>
+        <w:rPr>
+          <w:rFonts w:ascii="宋体" w:hAnsi="宋体" w:eastAsia="宋体"/>
+          <w:sz w:val="21"/>
+        </w:rPr>
+        <w:t>图8给出了由 export_package 中采区规划案例和采掘接续案例拼接形成的组合式结果图。其中，子图 (a) 展示采区规划阶段的空间分布结果，说明在完成边界、钻孔与参数场构建后，规划模块已经能够形成统一边界约束下的候选空间对象；子图 (b) 则展示采掘接续阶段的空间分布结果，说明同一批规划对象可以继续进入接续组织环节，并以规则化工作面条带的形式输出。与单纯界面截图相比，这张组合图更直接支撑本文“对象可传递、链路可贯通”的核心论点，即规划阶段形成的空间结果并不是终点，而是后续接续分析与经济评价的上游输入。需要同时说明的是，当前接续结果仍属于样例级输出，接口校核中的约束提示尚未完全消除，因此这里更适合作为链路贯通证据，而非真实矿井条件下的最终工程定案。</w:t>
       </w:r>
     </w:p>
     <w:p>
@@ -4752,7 +4859,7 @@
           <w:rFonts w:ascii="宋体" w:hAnsi="宋体" w:eastAsia="宋体"/>
           <w:sz w:val="21"/>
         </w:rPr>
-        <w:t>除主链路外，系统还提供基于 GNN 的扩展建模接口，用于探索小样本条件下的结构化地质预测。样例运行结果如图8所示。</w:t>
+        <w:t>除主链路外，系统还提供基于 GNN 的扩展建模接口，用于探索小样本条件下的结构化地质预测。样例运行结果如图9所示。</w:t>
       </w:r>
     </w:p>
     <w:p>
@@ -4774,8 +4881,8 @@
       <w:r>
         <w:drawing>
           <wp:inline xmlns:a="http://schemas.openxmlformats.org/drawingml/2006/main" xmlns:pic="http://schemas.openxmlformats.org/drawingml/2006/picture">
-            <wp:extent cx="6263640" cy="3706954"/>
-            <wp:docPr id="8" name="Picture 8"/>
+            <wp:extent cx="6263640" cy="3489466"/>
+            <wp:docPr id="9" name="Picture 9"/>
             <wp:cNvGraphicFramePr>
               <a:graphicFrameLocks noChangeAspect="1"/>
             </wp:cNvGraphicFramePr>
@@ -4783,11 +4890,11 @@
               <a:graphicData uri="http://schemas.openxmlformats.org/drawingml/2006/picture">
                 <pic:pic>
                   <pic:nvPicPr>
-                    <pic:cNvPr id="0" name="图4_GNN煤层厚度预测网格图.png"/>
+                    <pic:cNvPr id="0" name="图9_GNN煤层厚度预测网格图_论文版.png"/>
                     <pic:cNvPicPr/>
                   </pic:nvPicPr>
                   <pic:blipFill>
-                    <a:blip r:embed="rId16"/>
+                    <a:blip r:embed="rId17"/>
                     <a:stretch>
                       <a:fillRect/>
                     </a:stretch>
@@ -4795,7 +4902,7 @@
                   <pic:spPr>
                     <a:xfrm>
                       <a:off x="0" y="0"/>
-                      <a:ext cx="6263640" cy="3706954"/>
+                      <a:ext cx="6263640" cy="3489466"/>
                     </a:xfrm>
                     <a:prstGeom prst="rect"/>
                   </pic:spPr>
@@ -4817,7 +4924,7 @@
           <w:b w:val="0"/>
           <w:sz w:val="20"/>
         </w:rPr>
-        <w:t>图8 GNN煤层厚度预测网格图</w:t>
+        <w:t>图9 GNN煤层厚度预测网格图</w:t>
       </w:r>
     </w:p>
     <w:p>
@@ -4841,7 +4948,7 @@
           <w:rFonts w:ascii="宋体" w:hAnsi="宋体" w:eastAsia="宋体"/>
           <w:sz w:val="21"/>
         </w:rPr>
-        <w:t>图8表明扩展建模链路已经具备从样本装载、模型训练到空间网格输出的完整技术接口。图中给出的 MAE=0.5141、RMSE=0.6157 和 R²=-0.0436 等指标，更适合被理解为“接口已打通、流程可执行”的技术证据，而非“模型预测性能已经成熟”的学术证据。从系统架构角度看，这一接口的意义在于验证平台并非封闭的单任务工具，而是可以继续吸纳数据驱动模型的开放式框架。</w:t>
+        <w:t>图9表明扩展建模链路已经具备从样本装载、模型训练到空间网格输出的完整技术接口。图中给出的 MAE=0.5141、RMSE=0.6157 和 R²=-0.0436 等指标，更适合被理解为“接口已打通、流程可执行”的技术证据，而非“模型预测性能已经成熟”的学术证据。从系统架构角度看，这一接口的意义在于验证平台并非封闭的单任务工具，而是可以继续吸纳数据驱动模型的开放式框架。</w:t>
       </w:r>
     </w:p>
     <w:p>
@@ -4893,7 +5000,7 @@
           <w:rFonts w:ascii="宋体" w:hAnsi="宋体" w:eastAsia="宋体"/>
           <w:sz w:val="21"/>
         </w:rPr>
-        <w:t>本文方法的核心价值，不在于单点提出一种完全替代现有地质建模、规划求解或经济评价理论的新算法，而在于把原本分散在多个工作环节中的输入、约束、求解和评价过程组织为可连续传递的方法链。相较于传统“先布局、后校核、再补评价”的割裂流程，本文更强调在规划早期就将地质参数场、风险约束和后续评价需求统一纳入同一求解语境，从而减少因环节割裂带来的信息损耗和人工重构。</w:t>
+        <w:t>本文方法的核心价值，不在于单点提出一种替代现有地质建模、规划求解或经济评价理论的新算法，而在于把原本分散在多个工作环节中的输入、约束、求解和评价过程组织为可连续传递的方法链。相较于传统“先布局、后校核、再补评价”的割裂流程，本文强调在规划早期即同步组织地质参数场、风险约束和后续评价需求，从而减少由环节割裂带来的信息损耗和人工重构。</w:t>
       </w:r>
     </w:p>
     <w:p>
@@ -4906,7 +5013,7 @@
           <w:rFonts w:ascii="宋体" w:hAnsi="宋体" w:eastAsia="宋体"/>
           <w:sz w:val="21"/>
         </w:rPr>
-        <w:t>这种一体化组织至少体现为三方面价值。第一，规划输入、中间模型结果和输出对象被纳入统一数据上下文，降低了重复整理、口径不一致和人工转译的代价。第二，ODI 风险组织不再只是布局完成后的解释性附注，而是以前置约束和评价依据的形式参与候选方案生成与筛选，使风险分析真正进入方案形成阶段。第三，布局结果能够继续传递到接续与经济分析模块，使“方案生成-方案复核-方案比较”之间不再依赖离散文件和人工拼接，更接近真实工程决策所要求的连续工作流。</w:t>
+        <w:t>这种一体化组织至少体现为三方面价值。第一，规划输入、中间模型结果和输出对象被纳入统一数据上下文，降低了重复整理、口径不一致和人工转译的代价。第二，ODI 风险组织不再只是布局完成后的解释性附注，而是以前置约束和评价依据的形式参与候选方案生成与筛选，使风险分析真正进入方案形成阶段。第三，布局结果能够继续传递到接续与经济分析模块，使方案生成、复核和比较建立在同一对象体系之上，更接近真实工程决策所要求的连续工作流。</w:t>
       </w:r>
     </w:p>
     <w:p>
@@ -4919,7 +5026,7 @@
           <w:rFonts w:ascii="宋体" w:hAnsi="宋体" w:eastAsia="宋体"/>
           <w:sz w:val="21"/>
         </w:rPr>
-        <w:t>需要指出的是，本文所强调的优势首先是一种方法组织层面的改进，而不是对某一成熟优化算法性能的直接超越。因此，当前稿件更适合被理解为“采区智能规划设计一体化方法与系统”的方法论验证稿：其主要贡献在于建立统一链路、明确对象关系并完成样例条件下的端到端证据闭环。至于相对于传统流程究竟能够带来多大幅度的工程收益，还需要通过敏东矿等真实案例的对照实验进一步量化。</w:t>
+        <w:t>需要指出的是，本文所强调的优势首先是一种方法组织层面的改进，而不是对某一成熟优化算法性能的直接超越。因此，当前稿件更适合被界定为方法论验证稿：其主要贡献在于建立统一链路、明确对象关系并完成样例条件下的端到端证据闭环。至于相对于传统流程究竟能够带来多大幅度的工程收益，仍需通过敏东矿等真实案例的对照实验进一步量化。</w:t>
       </w:r>
     </w:p>
     <w:p>
@@ -4945,7 +5052,7 @@
           <w:rFonts w:ascii="宋体" w:hAnsi="宋体" w:eastAsia="宋体"/>
           <w:sz w:val="21"/>
         </w:rPr>
-        <w:t>需要明确的是，当前稿件虽然已经形成较完整的方法论证和图表体系，但仍存在清晰且必须正面说明的投稿边界。首先，现有验证证据主要来源于样例数据、已有程序输出以及针对接口链路的复核结果，尚未形成“真实矿井案例-传统基线方案-一体化方法方案”的成组对照证据，因此论文当前更适合论证方法可行性与链路有效性，而不宜直接外推为普适工程优越性。其次，ODI 在不同地质条件、不同风险偏好和不同约束场景下的参数标定尚未系统展开，因此更适合将其界定为统一风险组织框架，而非已经完成广泛工程标定的标准化行业模型。</w:t>
+        <w:t>需要明确的是，当前稿件虽然已经形成较完整的方法论证和图表体系，但仍存在清晰且必须正面说明的投稿边界。首先，现有验证证据主要来源于样例数据、已有程序输出以及针对接口链路的复核结果，尚未形成“真实矿井案例-传统基线方案-一体化方法方案”的成组对照证据，因此本文当前更适合论证方法可行性与链路有效性，而不宜直接外推为普适工程优越性。其次，ODI 在不同地质条件、风险偏好和约束场景下的参数标定尚未系统展开，因此更适合被界定为统一风险组织框架，而非已完成广泛工程标定的标准化行业模型。</w:t>
       </w:r>
     </w:p>
     <w:p>
@@ -4958,7 +5065,7 @@
           <w:rFonts w:ascii="宋体" w:hAnsi="宋体" w:eastAsia="宋体"/>
           <w:sz w:val="21"/>
         </w:rPr>
-        <w:t>再次，从当前规划结果本身看，虽然系统已生成 3 个工作面和 11 条巷道，并完成了布局对象、结构化文件和可视化图件的同步输出，但接口校核仍给出了“推进长度小于最小值 800.0 m”的提示。这说明现阶段结果已经足以作为候选设计对象、链路贯通证据和后续对照实验底稿，却尚未达到可直接作为真实生产方案提交终判的约束满足水平。对这一点在正文中予以明确，并不会削弱论文可信度，反而有助于把方法稿与工程终判稿严格区分。</w:t>
+        <w:t>再次，从当前规划结果本身看，虽然系统已生成 3 个工作面和 11 条巷道，并完成了布局对象、结构化文件和可视化图件的同步输出，但接口校核仍给出了“推进长度小于最小值 800.0 m”的提示。这说明现阶段结果已经足以作为候选设计对象、链路贯通证据和后续对照实验底稿，却尚未达到可直接作为真实生产方案提交终判的约束满足水平。正文对这一点作出明确说明，并不会削弱论文可信度，反而有助于把方法稿与工程终判稿严格区分。</w:t>
       </w:r>
     </w:p>
     <w:p>
@@ -4971,7 +5078,7 @@
           <w:rFonts w:ascii="宋体" w:hAnsi="宋体" w:eastAsia="宋体"/>
           <w:sz w:val="21"/>
         </w:rPr>
-        <w:t>最后，稿件仍有少量投稿层面的收口工作尚未完成，包括敏东矿实证材料的进一步补充、基金与作者简介信息的完善，以及首页脚注等期刊化元信息的补齐。因此，就当前状态而言，本文已经基本具备“高质量方法稿”的主体形态，但距离“实矿对照证据充分、元信息完整、可直接送审的终稿”仍存在一个明确的增强阶段。</w:t>
+        <w:t>最后，稿件仍有少量投稿层面的收口工作尚未完成，包括敏东矿实证材料的进一步补充、基金与作者简介信息的完善，以及首页脚注等期刊化元信息的补齐。因此，就当前状态而言，本文已经基本具备方法稿主体形态，但距离“实矿对照证据充分、元信息完整、可直接送审的终稿”仍存在明确的增强阶段。</w:t>
       </w:r>
     </w:p>
     <w:p>
@@ -4997,7 +5104,7 @@
           <w:rFonts w:ascii="宋体" w:hAnsi="宋体" w:eastAsia="宋体"/>
           <w:sz w:val="21"/>
         </w:rPr>
-        <w:t>为进一步达到正式投稿要求，后续工作宜从三个方向推进。第一，以敏东矿为优先实证对象，引入真实矿井案例和传统规划流程基线方案，建立“传统流程-一体化方法”的对照证据，并报告可比较的工程指标。第二，围绕 ODI 多场景参数开展标定与敏感性分析，补充置信区间、显著性检验和效应量层面的统计信息，增强方法的可解释性和可复现性。第三，继续完善作者信息、基金项目、期刊模板细节以及高分辨率图件，使稿件由“方法链可证明”进一步推进到“案例证据可支撑”的正式投稿状态。</w:t>
+        <w:t>为进一步达到正式投稿要求，后续工作宜从三个方向推进。第一，以敏东矿为优先实证对象，引入真实矿井案例和传统规划流程基线方案，建立“传统流程-一体化方法”的对照证据，并报告可比较的工程指标。第二，围绕 ODI 多场景参数开展标定与敏感性分析，补充不确定性与统计检验信息，增强方法的可解释性和可复现性。第三，继续完善作者信息、基金项目、期刊模板细节以及高分辨率图件，使稿件由“方法链可证明”进一步推进到“案例证据可支撑”的正式投稿状态。</w:t>
       </w:r>
     </w:p>
     <w:p>
@@ -5034,7 +5141,7 @@
           <w:rFonts w:ascii="宋体" w:hAnsi="宋体" w:eastAsia="宋体"/>
           <w:sz w:val="21"/>
         </w:rPr>
-        <w:t>通过引入多场景 ODI 中介变量，将地表沉陷、含水层扰动和上行开采等异构风险信息纳入统一框架，使风险约束能够以前置方式进入候选方案生成、筛选和后续接续评价过程，为采区规划中的风险组织提供了统一表达。</w:t>
+        <w:t>通过引入多场景 ODI 统一风险表达，将地表沉陷、含水层扰动和上行开采等异构风险纳入同一约束框架，使风险分析能够以前置方式进入候选方案生成、筛选和后续接续评价过程。</w:t>
       </w:r>
     </w:p>
     <w:p>
@@ -5046,19 +5153,7 @@
           <w:rFonts w:ascii="宋体" w:hAnsi="宋体" w:eastAsia="宋体"/>
           <w:sz w:val="21"/>
         </w:rPr>
-        <w:t>样例条件下的贯通验证表明，系统能够以 15 个钻孔样点为输入，输出 3 个工作面、11 条巷道以及多类关键图件和结构化结果文件，说明所提方法已具备连续运行与对象传递能力。</w:t>
-      </w:r>
-    </w:p>
-    <w:p>
-      <w:pPr>
-        <w:pStyle w:val="ListNumber"/>
-      </w:pPr>
-      <w:r>
-        <w:rPr>
-          <w:rFonts w:ascii="宋体" w:hAnsi="宋体" w:eastAsia="宋体"/>
-          <w:sz w:val="21"/>
-        </w:rPr>
-        <w:t>当前证据仍主要停留在样例验证层面，工作面推进长度校核、ODI 参数标定、敏东矿实矿案例及基线对照尚待补充，因此本文结论应被理解为一体化方法链已经建立并完成样例论证，而非真实矿井条件下的终局优选结论。</w:t>
+        <w:t>样例验证表明，系统能够以 15 个钻孔样点为输入，输出 3 个工作面、11 条巷道以及多类关键图件和结构化结果文件，说明所提方法已具备连续运行与对象传递能力；但当前证据仍主要停留在样例论证层面，真实矿井条件下的优选结论仍需结合实矿案例、参数标定和基线对照进一步检验。</w:t>
       </w:r>
     </w:p>
     <w:p>

</xml_diff>